<commit_message>
Implement empirical performance improvements, Tweedie/Log1p experiments, production inventory engine, and updated research paper
</commit_message>
<xml_diff>
--- a/ML_Inventory_Decision_Support_Paper.docx
+++ b/ML_Inventory_Decision_Support_Paper.docx
@@ -64,7 +64,7 @@
           <w:i/>
           <w:sz w:val="20"/>
         </w:rPr>
-        <w:t>Modern retail supply chains operate under severe exposure to demand volatility, where uncoordinated replenishment policies lead directly to either costly stockouts or bloated working capital allocations. While classical statistical inventory models assume known, stationary demand distributions, real-world retail environments exhibit non-stationary seasonality, holiday-induced purchasing surges, macroeconomic sensitivity, and intermittent zero-sales patterns. Concurrently, machine learning literature frequently treats demand forecasting as an isolated regression task, ignoring how forecast error variances cascade into operational safety buffers and order lot dimensioning. This paper presents an end-to-end, reproducible machine learning decision support architecture that bridges predictive forecasting with operational inventory control. We evaluate three distinct tree-based ensemble paradigms—Random Forest, Extreme Gradient Boosting (XGBoost), and Light Gradient Boosting Machine (LightGBM)—benchmarked against a Lag-1 naive persistence baseline across three heterogeneous retail datasets: the Walmart multi-store weekly sales panel, the Online Retail transactional database, and the M5 hierarchical grocery dataset. Feature pipelines incorporate calendar attributes, multi-period lags, and rolling momentum statistics under strict chronological isolation to guarantee zero data leakage. The empirical findings reveal that gradient boosted ensembles achieve substantial gains over traditional persistence baselines: on the Walmart panel, XGBoost reduced Root Mean Squared Error (RMSE) to $59,280.08 (R² = 0.9876, a 21.6% error reduction over the baseline), while on the intermittent M5 grocery benchmark, XGBoost achieved an RMSE of 2.278 (R² = 0.3635, a 28.9% error reduction). For the high-variance Online Retail stream, Random Forest achieved the lowest Mean Absolute Error (MAE = 19.67 units). Point forecasts (d̂) and training-period standard deviations (σ_d) are subsequently coupled with stochastic continuous-review inventory formulations, deriving dynamic Safety Stock (SS), Reorder Points (ROP), and Economic Order Quantities (EOQ) at a target 95% cycle service level. The resulting system demonstrates an operational framework for continuous inventory optimization without fabricating unobservable warehouse bin states.</w:t>
+        <w:t>Modern retail supply chains operate under severe exposure to demand volatility, where uncoordinated replenishment policies lead directly to either costly stockouts or bloated working capital allocations. While classical statistical inventory models assume known, stationary demand distributions, real-world retail environments exhibit non-stationary seasonality, holiday-induced purchasing surges, macroeconomic sensitivity, and intermittent zero-sales patterns. Concurrently, machine learning literature frequently treats demand forecasting as an isolated regression task, ignoring how forecast error variances cascade into operational safety buffers and order lot dimensioning. This paper presents an end-to-end, reproducible machine learning decision support architecture that bridges predictive forecasting with operational inventory control. We evaluate three distinct tree-based ensemble paradigms—Random Forest, Extreme Gradient Boosting (XGBoost), and Light Gradient Boosting Machine (LightGBM)—benchmarked against a Lag-1 naive persistence baseline across three heterogeneous retail datasets: the Walmart multi-store weekly sales panel, the Online Retail transactional database, and the M5 hierarchical grocery dataset. Feature pipelines incorporate calendar attributes, multi-period lags, and rolling momentum statistics under strict chronological isolation to guarantee zero data leakage. Through systematic empirical experimentation, we demonstrate significant performance gains over baselines and standard configurations: on the Walmart panel, an optimized, regularized XGBoost model incorporating cyclical harmonic encodings and rolling momentum velocity ratios reduced Root Mean Squared Error (RMSE) to $53,416.17 (R² = 0.9900, a 29.1% error reduction over the naive baseline of $75,313.17 and a $2,018.69/wk reduction over default XGBoost). On the intermittent M5 grocery benchmark (empirically audited at 63.28% zero sales), transitioning from squared error loss to a compound Poisson-Gamma Tweedie deviance objective (p=1.5) achieved the lowest holdout error with an RMSE of 2.257 (R² = 0.3754, a 29.5% error reduction over baseline). On the skewed Online Retail transaction stream, applying a logarithmic target transformation (log(1+y)) reduced holdout Mean Absolute Error (MAE) by 26.9% to 17.91 units, effectively insulating inventory buffers from extreme commercial order spikes. Point forecasts (d̂) and training-period standard deviations (σ_d) are subsequently coupled with stochastic continuous-review inventory formulations, deriving dynamic Safety Stock (SS), Reorder Points (ROP), and Economic Order Quantities (EOQ) at a target 95% cycle service level. The resulting system demonstrates an operational framework for continuous inventory optimization without fabricating unobservable warehouse bin states.</w:t>
       </w:r>
     </w:p>
     <w:p>
@@ -83,7 +83,7 @@
         <w:rPr>
           <w:sz w:val="20"/>
         </w:rPr>
-        <w:t>Demand Forecasting, Inventory Decision Support, Gradient Boosted Trees, XGBoost, LightGBM, Random Forest, Safety Stock, Reorder Point, Economic Order Quantity, Supply Chain Management.</w:t>
+        <w:t>Demand Forecasting, Inventory Decision Support, Gradient Boosted Trees, XGBoost, LightGBM, Random Forest, Tweedie Loss, Log1p Transformation, Safety Stock, Reorder Point, Economic Order Quantity, Supply Chain Management.</w:t>
       </w:r>
     </w:p>
     <w:p>
@@ -124,7 +124,7 @@
         <w:br/>
         <w:t>2. Strict Chronological Evaluation: We design a leak-free temporal validation protocol, enforcing shift-before-rolling mechanisms to prevent look-ahead bias across all lag and rolling statistical features.</w:t>
         <w:br/>
-        <w:t>3. Multi-Model Tree Ensemble Comparison: We provide an empirical head-to-head evaluation of Bagging (Random Forest) versus second-order Gradient Boosting (XGBoost) and histogram-based Gradient Boosting (LightGBM) evaluated across MAE, RMSE, MAPE, and R².</w:t>
+        <w:t>3. Objective-Aligned Loss Formulation: We formulate loss functions aligned with empirical data profiles, demonstrating that Tweedie compound Poisson-Gamma deviance resolves zero-inflation in grocery sales, while logarithmic transformations insulate retail buffers from wholesale order kurtosis.</w:t>
         <w:br/>
         <w:t>4. End-to-End Operational Decision Integration: We directly feed the machine learning demand forecasts (d̂) and empirically derived demand variances (σ_d) into stochastic safety stock (SS), continuous-review reorder point (ROP), and Economic Order Quantity (EOQ) equations at a 95% cycle service level, categorizing SKUs into actionable operational replenishment regimes.</w:t>
       </w:r>
@@ -398,9 +398,9 @@
         <w:br/>
         <w:t>Daily_Quantity_{i,t} = ∑_{k ∈ T_{i,t}} Quantity_{i,t,k}</w:t>
         <w:br/>
+        <w:t>• Transaction Representation Audit: In transactional retail databases, rows are generated only on active transaction dates. Rather than misrepresenting sparse dates as consecutive calendar intervals, the feature pipeline incorporates an explicit Days_Since_Last_Demand counter alongside lag observations that represent the k-th prior transaction event.</w:t>
+        <w:br/>
         <w:t>• Missing Value Imputation: Exogenous calendar events in M5 were encoded into boolean indicator flags (has_event). Missing historical shelf prices were imputed via forward and backward propagation within each individual item series.</w:t>
-        <w:br/>
-        <w:t>• Scale-Invariance Property: Because decision tree splits are invariant to monotonic transformations, continuous variables were retained in their original units ($, units, Celsius) to preserve post-hoc physical interpretability.</w:t>
       </w:r>
     </w:p>
     <w:p>
@@ -422,13 +422,15 @@
       <w:r>
         <w:t>Feature engineering converts raw time series into supervised tabular matrices. To strictly prevent temporal leakage, all lag variables and rolling statistics are calculated exclusively from past observations by applying a mandatory lag shift (shift(1)) prior to rolling window aggregations:</w:t>
         <w:br/>
-        <w:t>1. Calendar &amp; Seasonality Indicators: Day of week (w ∈ {0, …, 6}), month (m ∈ {1, …, 12}), ISO week of year, and weekend flags (I_{w ∈ [5,6]}).</w:t>
+        <w:t>1. Calendar &amp; Seasonality Indicators: Cyclical trigonometric harmonics (sin/cos month and week-of-year).</w:t>
         <w:br/>
         <w:t>2. Autoregressive Lag Variables: x_{i,t}^{(lag_k)} = y_{i, t-k} for k ∈ {1, 2, 4, 7, 14}.</w:t>
         <w:br/>
-        <w:t>3. Rolling Window Aggregations: Moving means μ_{i,t}^{(w)} and standard deviations σ_{i,t}^{(w)} calculated over historical windows w ∈ {4, 7, 28}.</w:t>
+        <w:t>3. Rolling Statistics &amp; Momentum Ratios: Moving means μ_{i,t}^{(w)} and standard deviations σ_{i,t}^{(w)} calculated over historical windows w ∈ {4, 7, 28}, alongside momentum velocity ratios:</w:t>
         <w:br/>
-        <w:t>Concurrent indicators (such as same-day transaction counts) were strictly excluded from feature matrices to prevent contemporaneous target leakage.</w:t>
+        <w:t>Momentum_{i,t} = RollMean_4 / (RollMean_8 + 10⁻⁵)</w:t>
+        <w:br/>
+        <w:t>Concurrent indicators (such as same-day transaction counts) were strictly excluded from feature matrices to eliminate contemporaneous target leakage.</w:t>
       </w:r>
     </w:p>
     <w:p>
@@ -454,7 +456,7 @@
         <w:br/>
         <w:t>ŷ_RF(x) = (1/B) · ∑_{b=1}^B T_b(x; Θ_b)</w:t>
         <w:br/>
-        <w:t>• Model 2: XGBoost Regressor: An additive tree ensemble optimizing a penalized objective function via second-order Taylor expansion gradients with regularized tree depth and shrinkage.</w:t>
+        <w:t>• Model 2: XGBoost Regressor: An additive tree ensemble optimizing a penalized objective function via second-order Taylor expansion gradients. In addition to standard squared error, we evaluate a Tweedie compound Poisson-Gamma deviance objective (p=1.5) for zero-inflated grocery data and a logarithmic target transformation for highly skewed order streams.</w:t>
         <w:br/>
         <w:t>• Model 3: LightGBM Regressor: A gradient boosting architecture that bins continuous feature values into discrete histograms (255 bins) and grows trees leaf-wise by selecting the leaf with maximum loss reduction.</w:t>
       </w:r>
@@ -480,7 +482,7 @@
         <w:br/>
         <w:t>• Walmart Sales: Earliest 80% dates (4,995 rows) → Holdout final 26 weeks (1,260 rows).</w:t>
         <w:br/>
-        <w:t>• Online Retail: Dec 2010 to Oct 2011 (230,813 rows) → Holdout Peak Q4 Nov–Dec 2011 (45,335 rows).</w:t>
+        <w:t>• Online Retail: Dec 2010 to Oct 2011 (201,685 rows after burn-in) → Holdout Peak Q4 Nov–Dec 2011 (45,335 rows).</w:t>
         <w:br/>
         <w:t>• M5 Grocery: Preceding 309 days (154,500 rows) → Final 28-day standard holdout (14,000 rows).</w:t>
         <w:br/>
@@ -512,7 +514,7 @@
         <w:br/>
         <w:t>• Reorder Point (ROP): ROP = (d̂ · L) + SS</w:t>
         <w:br/>
-        <w:t>• Economic Order Quantity (EOQ): EOQ = √((2 · D · S) / H), where D represents annualized forecast demand, S is fixed order setup cost, and H = i · Unit Price represents annual holding cost per unit (i = 20%).</w:t>
+        <w:t>• Economic Order Quantity (EOQ): EOQ = √((2 · D · S) / H), where D represents annualized forecast demand, S is fixed order setup cost, and H = max(0.50, i · Unit Price) represents annual holding cost per unit (i = 20%). For the Walmart dataset, where the target is aggregate monetary sales ($), the EOQ calculation represents a value-based planning approximation.</w:t>
       </w:r>
     </w:p>
     <w:p>
@@ -561,29 +563,33 @@
         <w:br/>
         <w:t>3: Extract calendar features: Month, WeekOfYear, DayOfWeek, Is_Weekend from date_col</w:t>
         <w:br/>
-        <w:t>4: For each unique entity e in D do:</w:t>
+        <w:t>4: Compute cyclical harmonic sine/cosine encodings for Month and WeekOfYear</w:t>
         <w:br/>
-        <w:t>5:     Compute autoregressive lags: Lag_k = Shift(D[e, y_col], k) for k ∈ {1, 2, 4, 7, 14}</w:t>
+        <w:t>5: For each unique entity e in D do:</w:t>
         <w:br/>
-        <w:t xml:space="preserve">6:     Compute rolling statistics: </w:t>
+        <w:t>6:     Compute autoregressive lags: Lag_k = Shift(D[e, y_col], k) for k ∈ {1, 2, 4, 7, 14}</w:t>
+        <w:br/>
+        <w:t xml:space="preserve">7:     Compute rolling statistics: </w:t>
         <w:br/>
         <w:t xml:space="preserve">           RollMean_w = Rolling_Mean(Shift(D[e, y_col], 1), window=w) for w ∈ {4, 7, 28}</w:t>
         <w:br/>
         <w:t xml:space="preserve">           RollStd_w  = Rolling_Std(Shift(D[e, y_col], 1), window=w) for w ∈ {4, 7}</w:t>
         <w:br/>
-        <w:t>7: End For</w:t>
+        <w:t xml:space="preserve">           Momentum   = RollMean_4 / (RollMean_8 + 1e-5)</w:t>
         <w:br/>
-        <w:t>8: Drop rows with NaN values resulting from lag/rolling window burn-in</w:t>
+        <w:t>8: End For</w:t>
         <w:br/>
-        <w:t>9: Define chronological cutoff timestamp T_split = Quantile(D[date_col], α)</w:t>
+        <w:t>9: Drop rows with NaN values resulting from lag/rolling window burn-in</w:t>
         <w:br/>
-        <w:t>10: Partition feature matrix X and target y:</w:t>
+        <w:t>10: Define chronological cutoff timestamp T_split = Quantile(D[date_col], α)</w:t>
+        <w:br/>
+        <w:t>11: Partition feature matrix X and target y:</w:t>
         <w:br/>
         <w:t xml:space="preserve">        Train = D[D[date_col] &lt; T_split]</w:t>
         <w:br/>
         <w:t xml:space="preserve">        Val   = D[D[date_col] ≥ T_split]</w:t>
         <w:br/>
-        <w:t>11: Return (X_train, y_train), (X_val, y_val)</w:t>
+        <w:t>12: Return (X_train, y_train), (X_val, y_val)</w:t>
         <w:br/>
         <w:t>─────────────────────────────────────────────────────────────────────────────</w:t>
       </w:r>
@@ -616,7 +622,7 @@
         <w:br/>
         <w:t xml:space="preserve"> 4: For each model M in Model_Suite do:</w:t>
         <w:br/>
-        <w:t xml:space="preserve"> 5:     Fit M on (X_train, y_train)</w:t>
+        <w:t xml:space="preserve"> 5:     Fit M on (X_train, y_train) with appropriate objective (SquaredError, Tweedie, or Log1p)</w:t>
         <w:br/>
         <w:t xml:space="preserve"> 6:     Generate out-of-sample predictions: y_pred = M.Predict(X_val)</w:t>
         <w:br/>
@@ -634,7 +640,7 @@
         <w:br/>
         <w:t xml:space="preserve"> 9: End For</w:t>
         <w:br/>
-        <w:t>10: Select best model M_best = ArgMin_M(RMSE_M)</w:t>
+        <w:t>10: Select best model M_best = ArgMin_M(RMSE_M) [or ArgMin_M(MAE_M) for replenishment sizing]</w:t>
         <w:br/>
         <w:t>11: Extract winning forecast d̂ = Mean(M_best.Predict(X_val)) for each entity e</w:t>
         <w:br/>
@@ -654,7 +660,13 @@
         <w:br/>
         <w:t xml:space="preserve">        Demand_CV           = σ_d / d̂</w:t>
         <w:br/>
-        <w:t>14: Assign replenishment operational recommendations based on Demand_CV thresholds</w:t>
+        <w:t>14: Assign replenishment operational recommendations based on Demand_CV thresholds:</w:t>
+        <w:br/>
+        <w:t xml:space="preserve">        If Demand_CV ≤ 0.50: 'Standard Continuous Review Replenishment'</w:t>
+        <w:br/>
+        <w:t xml:space="preserve">        If 0.50 &lt; Demand_CV ≤ 1.0: 'High Volatility Buffer — Monitor'</w:t>
+        <w:br/>
+        <w:t xml:space="preserve">        If Demand_CV &gt; 1.0: 'Intermittent SKU Buffer — Batch Replenish'</w:t>
         <w:br/>
         <w:t>15: Return M_comp, I_decision</w:t>
         <w:br/>
@@ -1057,7 +1069,7 @@
               <w:rPr>
                 <w:sz w:val="18"/>
               </w:rPr>
-              <w:t>DayOfWeek, UnitPrice, Month, Weekend</w:t>
+              <w:t>DayOfWeek, UnitPrice, Month, Days_Since_Last</w:t>
             </w:r>
           </w:p>
         </w:tc>
@@ -1174,7 +1186,7 @@
               <w:rPr>
                 <w:sz w:val="18"/>
               </w:rPr>
-              <w:t>SNAP, Event, Department, ShelfPrice</w:t>
+              <w:t>SNAP, Event, Department, ShelfPrice, ZeroRatio</w:t>
             </w:r>
           </w:p>
         </w:tc>
@@ -1193,7 +1205,7 @@
               <w:rPr>
                 <w:sz w:val="18"/>
               </w:rPr>
-              <w:t>Highly intermittent (71.9% zeros)</w:t>
+              <w:t>Highly intermittent (63.28% zeros)</w:t>
             </w:r>
           </w:p>
         </w:tc>
@@ -1234,7 +1246,7 @@
     </w:p>
     <w:p>
       <w:r>
-        <w:t>Table 2 reports the comprehensive out-of-sample chronological evaluation across all candidate models and baselines.</w:t>
+        <w:t>Table 2 reports the comprehensive out-of-sample chronological evaluation across all candidate models, loss functions, and baselines.</w:t>
       </w:r>
     </w:p>
     <w:tbl>
@@ -1359,7 +1371,7 @@
                 <w:color w:val="FFFFFF"/>
                 <w:sz w:val="19"/>
               </w:rPr>
-              <w:t>MAPE</w:t>
+              <w:t>MAPE (%)</w:t>
             </w:r>
           </w:p>
         </w:tc>
@@ -1462,7 +1474,7 @@
               <w:rPr>
                 <w:sz w:val="18"/>
               </w:rPr>
-              <w:t>$50,734.82</w:t>
+              <w:t>$50,361.57</w:t>
             </w:r>
           </w:p>
         </w:tc>
@@ -1481,7 +1493,7 @@
               <w:rPr>
                 <w:sz w:val="18"/>
               </w:rPr>
-              <w:t>$75,599.30</w:t>
+              <w:t>$75,313.17</w:t>
             </w:r>
           </w:p>
         </w:tc>
@@ -1500,7 +1512,7 @@
               <w:rPr>
                 <w:sz w:val="18"/>
               </w:rPr>
-              <w:t>4.93%</w:t>
+              <w:t>4.89%</w:t>
             </w:r>
           </w:p>
         </w:tc>
@@ -1519,7 +1531,7 @@
               <w:rPr>
                 <w:sz w:val="18"/>
               </w:rPr>
-              <w:t>0.9799</w:t>
+              <w:t>0.9801</w:t>
             </w:r>
           </w:p>
         </w:tc>
@@ -1580,7 +1592,7 @@
               <w:rPr>
                 <w:sz w:val="18"/>
               </w:rPr>
-              <w:t>Model 1: Random Forest</w:t>
+              <w:t>Model 1: Random Forest (Reg)</w:t>
             </w:r>
           </w:p>
         </w:tc>
@@ -1600,7 +1612,7 @@
               <w:rPr>
                 <w:sz w:val="18"/>
               </w:rPr>
-              <w:t>$47,816.50</w:t>
+              <w:t>$42,304.37</w:t>
             </w:r>
           </w:p>
         </w:tc>
@@ -1620,7 +1632,7 @@
               <w:rPr>
                 <w:sz w:val="18"/>
               </w:rPr>
-              <w:t>$67,566.68</w:t>
+              <w:t>$60,194.98</w:t>
             </w:r>
           </w:p>
         </w:tc>
@@ -1640,7 +1652,7 @@
               <w:rPr>
                 <w:sz w:val="18"/>
               </w:rPr>
-              <w:t>4.65%</w:t>
+              <w:t>4.15%</w:t>
             </w:r>
           </w:p>
         </w:tc>
@@ -1660,7 +1672,7 @@
               <w:rPr>
                 <w:sz w:val="18"/>
               </w:rPr>
-              <w:t>0.9839</w:t>
+              <w:t>0.9873</w:t>
             </w:r>
           </w:p>
         </w:tc>
@@ -1720,7 +1732,7 @@
               <w:rPr>
                 <w:sz w:val="18"/>
               </w:rPr>
-              <w:t>Model 2: XGBoost</w:t>
+              <w:t>Model 2: XGBoost (Old Default)</w:t>
             </w:r>
           </w:p>
         </w:tc>
@@ -1739,7 +1751,7 @@
               <w:rPr>
                 <w:sz w:val="18"/>
               </w:rPr>
-              <w:t>$41,344.45</w:t>
+              <w:t>$37,976.16</w:t>
             </w:r>
           </w:p>
         </w:tc>
@@ -1758,7 +1770,7 @@
               <w:rPr>
                 <w:sz w:val="18"/>
               </w:rPr>
-              <w:t>$59,280.08</w:t>
+              <w:t>$55,434.86</w:t>
             </w:r>
           </w:p>
         </w:tc>
@@ -1777,7 +1789,7 @@
               <w:rPr>
                 <w:sz w:val="18"/>
               </w:rPr>
-              <w:t>4.20%</w:t>
+              <w:t>3.73%</w:t>
             </w:r>
           </w:p>
         </w:tc>
@@ -1796,7 +1808,7 @@
               <w:rPr>
                 <w:sz w:val="18"/>
               </w:rPr>
-              <w:t>0.9876</w:t>
+              <w:t>0.9892</w:t>
             </w:r>
           </w:p>
         </w:tc>
@@ -1809,15 +1821,13 @@
               <w:left w:w="150" w:type="dxa"/>
               <w:right w:w="150" w:type="dxa"/>
             </w:tcMar>
-            <w:shd w:fill="D4EDDA"/>
           </w:tcPr>
           <w:p>
             <w:r>
               <w:rPr>
-                <w:b/>
                 <w:sz w:val="18"/>
               </w:rPr>
-              <w:t>WINNER (Selected)</w:t>
+              <w:t>Previous Best</w:t>
             </w:r>
           </w:p>
         </w:tc>
@@ -1859,7 +1869,7 @@
               <w:rPr>
                 <w:sz w:val="18"/>
               </w:rPr>
-              <w:t>Model 3: LightGBM</w:t>
+              <w:t>Model 2: XGBoost (Optimized)</w:t>
             </w:r>
           </w:p>
         </w:tc>
@@ -1879,7 +1889,7 @@
               <w:rPr>
                 <w:sz w:val="18"/>
               </w:rPr>
-              <w:t>$42,102.27</w:t>
+              <w:t>$37,234.18</w:t>
             </w:r>
           </w:p>
         </w:tc>
@@ -1899,7 +1909,7 @@
               <w:rPr>
                 <w:sz w:val="18"/>
               </w:rPr>
-              <w:t>$60,293.23</w:t>
+              <w:t>$53,416.17</w:t>
             </w:r>
           </w:p>
         </w:tc>
@@ -1919,7 +1929,7 @@
               <w:rPr>
                 <w:sz w:val="18"/>
               </w:rPr>
-              <w:t>4.14%</w:t>
+              <w:t>3.76%</w:t>
             </w:r>
           </w:p>
         </w:tc>
@@ -1939,7 +1949,7 @@
               <w:rPr>
                 <w:sz w:val="18"/>
               </w:rPr>
-              <w:t>0.9872</w:t>
+              <w:t>0.9900</w:t>
             </w:r>
           </w:p>
         </w:tc>
@@ -1952,14 +1962,15 @@
               <w:left w:w="150" w:type="dxa"/>
               <w:right w:w="150" w:type="dxa"/>
             </w:tcMar>
-            <w:shd w:fill="F8F9FA"/>
+            <w:shd w:fill="D4EDDA"/>
           </w:tcPr>
           <w:p>
             <w:r>
               <w:rPr>
+                <w:b/>
                 <w:sz w:val="18"/>
               </w:rPr>
-              <w:t>Runner-Up</w:t>
+              <w:t>🏆 WINNER (Best Performer)</w:t>
             </w:r>
           </w:p>
         </w:tc>
@@ -1980,7 +1991,7 @@
               <w:rPr>
                 <w:sz w:val="18"/>
               </w:rPr>
-              <w:t>Online Retail</w:t>
+              <w:t>Walmart Sales</w:t>
             </w:r>
           </w:p>
         </w:tc>
@@ -1999,7 +2010,7 @@
               <w:rPr>
                 <w:sz w:val="18"/>
               </w:rPr>
-              <w:t>Lag-1 Naive Baseline</w:t>
+              <w:t>Model 3: LightGBM (Optimized)</w:t>
             </w:r>
           </w:p>
         </w:tc>
@@ -2018,7 +2029,7 @@
               <w:rPr>
                 <w:sz w:val="18"/>
               </w:rPr>
-              <w:t>24.49 units</w:t>
+              <w:t>$37,081.03</w:t>
             </w:r>
           </w:p>
         </w:tc>
@@ -2037,7 +2048,7 @@
               <w:rPr>
                 <w:sz w:val="18"/>
               </w:rPr>
-              <w:t>387.56 units</w:t>
+              <w:t>$53,623.64</w:t>
             </w:r>
           </w:p>
         </w:tc>
@@ -2056,7 +2067,7 @@
               <w:rPr>
                 <w:sz w:val="18"/>
               </w:rPr>
-              <w:t>295.90%</w:t>
+              <w:t>3.65%</w:t>
             </w:r>
           </w:p>
         </w:tc>
@@ -2075,7 +2086,7 @@
               <w:rPr>
                 <w:sz w:val="18"/>
               </w:rPr>
-              <w:t>-0.0128</w:t>
+              <w:t>0.9899</w:t>
             </w:r>
           </w:p>
         </w:tc>
@@ -2094,7 +2105,7 @@
               <w:rPr>
                 <w:sz w:val="18"/>
               </w:rPr>
-              <w:t>Baseline Benchmark</w:t>
+              <w:t>Competitive Runner-Up</w:t>
             </w:r>
           </w:p>
         </w:tc>
@@ -2136,7 +2147,7 @@
               <w:rPr>
                 <w:sz w:val="18"/>
               </w:rPr>
-              <w:t>Model 1: Random Forest</w:t>
+              <w:t>Lag-1 Naive Baseline</w:t>
             </w:r>
           </w:p>
         </w:tc>
@@ -2156,7 +2167,7 @@
               <w:rPr>
                 <w:sz w:val="18"/>
               </w:rPr>
-              <w:t>19.67 units</w:t>
+              <w:t>24.49 units</w:t>
             </w:r>
           </w:p>
         </w:tc>
@@ -2176,7 +2187,7 @@
               <w:rPr>
                 <w:sz w:val="18"/>
               </w:rPr>
-              <w:t>384.40 units</w:t>
+              <w:t>387.56 units</w:t>
             </w:r>
           </w:p>
         </w:tc>
@@ -2196,7 +2207,7 @@
               <w:rPr>
                 <w:sz w:val="18"/>
               </w:rPr>
-              <w:t>292.78%</w:t>
+              <w:t>295.90%</w:t>
             </w:r>
           </w:p>
         </w:tc>
@@ -2216,7 +2227,7 @@
               <w:rPr>
                 <w:sz w:val="18"/>
               </w:rPr>
-              <w:t>0.0036</w:t>
+              <w:t>-0.0128</w:t>
             </w:r>
           </w:p>
         </w:tc>
@@ -2229,15 +2240,14 @@
               <w:left w:w="150" w:type="dxa"/>
               <w:right w:w="150" w:type="dxa"/>
             </w:tcMar>
-            <w:shd w:fill="D4EDDA"/>
+            <w:shd w:fill="F8F9FA"/>
           </w:tcPr>
           <w:p>
             <w:r>
               <w:rPr>
-                <w:b/>
                 <w:sz w:val="18"/>
               </w:rPr>
-              <w:t>WINNER (Selected)</w:t>
+              <w:t>Baseline Benchmark</w:t>
             </w:r>
           </w:p>
         </w:tc>
@@ -2277,7 +2287,7 @@
               <w:rPr>
                 <w:sz w:val="18"/>
               </w:rPr>
-              <w:t>Model 2: XGBoost</w:t>
+              <w:t>Model 1: Random Forest</w:t>
             </w:r>
           </w:p>
         </w:tc>
@@ -2296,7 +2306,7 @@
               <w:rPr>
                 <w:sz w:val="18"/>
               </w:rPr>
-              <w:t>19.88 units</w:t>
+              <w:t>20.93 units</w:t>
             </w:r>
           </w:p>
         </w:tc>
@@ -2315,7 +2325,7 @@
               <w:rPr>
                 <w:sz w:val="18"/>
               </w:rPr>
-              <w:t>384.22 units</w:t>
+              <w:t>384.68 units</w:t>
             </w:r>
           </w:p>
         </w:tc>
@@ -2334,7 +2344,7 @@
               <w:rPr>
                 <w:sz w:val="18"/>
               </w:rPr>
-              <w:t>292.13%</w:t>
+              <w:t>355.55%</w:t>
             </w:r>
           </w:p>
         </w:tc>
@@ -2353,7 +2363,7 @@
               <w:rPr>
                 <w:sz w:val="18"/>
               </w:rPr>
-              <w:t>0.0045</w:t>
+              <w:t>0.0022</w:t>
             </w:r>
           </w:p>
         </w:tc>
@@ -2372,7 +2382,7 @@
               <w:rPr>
                 <w:sz w:val="18"/>
               </w:rPr>
-              <w:t>Competitive</w:t>
+              <w:t>Evaluated</w:t>
             </w:r>
           </w:p>
         </w:tc>
@@ -2414,7 +2424,7 @@
               <w:rPr>
                 <w:sz w:val="18"/>
               </w:rPr>
-              <w:t>Model 3: LightGBM</w:t>
+              <w:t>Model 2: XGBoost (Standard MSE)</w:t>
             </w:r>
           </w:p>
         </w:tc>
@@ -2434,7 +2444,7 @@
               <w:rPr>
                 <w:sz w:val="18"/>
               </w:rPr>
-              <w:t>19.71 units</w:t>
+              <w:t>20.41 units</w:t>
             </w:r>
           </w:p>
         </w:tc>
@@ -2454,7 +2464,7 @@
               <w:rPr>
                 <w:sz w:val="18"/>
               </w:rPr>
-              <w:t>384.22 units</w:t>
+              <w:t>384.37 units</w:t>
             </w:r>
           </w:p>
         </w:tc>
@@ -2474,7 +2484,7 @@
               <w:rPr>
                 <w:sz w:val="18"/>
               </w:rPr>
-              <w:t>296.50%</w:t>
+              <w:t>352.05%</w:t>
             </w:r>
           </w:p>
         </w:tc>
@@ -2494,7 +2504,287 @@
               <w:rPr>
                 <w:sz w:val="18"/>
               </w:rPr>
-              <w:t>0.0045</w:t>
+              <w:t>0.0038</w:t>
+            </w:r>
+          </w:p>
+        </w:tc>
+        <w:tc>
+          <w:tcPr>
+            <w:tcW w:type="dxa" w:w="1337"/>
+            <w:tcMar>
+              <w:top w:w="70" w:type="dxa"/>
+              <w:bottom w:w="70" w:type="dxa"/>
+              <w:left w:w="150" w:type="dxa"/>
+              <w:right w:w="150" w:type="dxa"/>
+            </w:tcMar>
+            <w:shd w:fill="D4EDDA"/>
+          </w:tcPr>
+          <w:p>
+            <w:r>
+              <w:rPr>
+                <w:b/>
+                <w:sz w:val="18"/>
+              </w:rPr>
+              <w:t>🏆 WINNER (Best RMSE)</w:t>
+            </w:r>
+          </w:p>
+        </w:tc>
+      </w:tr>
+      <w:tr>
+        <w:tc>
+          <w:tcPr>
+            <w:tcW w:type="dxa" w:w="1337"/>
+            <w:tcMar>
+              <w:top w:w="70" w:type="dxa"/>
+              <w:bottom w:w="70" w:type="dxa"/>
+              <w:left w:w="150" w:type="dxa"/>
+              <w:right w:w="150" w:type="dxa"/>
+            </w:tcMar>
+          </w:tcPr>
+          <w:p>
+            <w:r>
+              <w:rPr>
+                <w:sz w:val="18"/>
+              </w:rPr>
+              <w:t>Online Retail</w:t>
+            </w:r>
+          </w:p>
+        </w:tc>
+        <w:tc>
+          <w:tcPr>
+            <w:tcW w:type="dxa" w:w="1337"/>
+            <w:tcMar>
+              <w:top w:w="70" w:type="dxa"/>
+              <w:bottom w:w="70" w:type="dxa"/>
+              <w:left w:w="150" w:type="dxa"/>
+              <w:right w:w="150" w:type="dxa"/>
+            </w:tcMar>
+          </w:tcPr>
+          <w:p>
+            <w:r>
+              <w:rPr>
+                <w:sz w:val="18"/>
+              </w:rPr>
+              <w:t>Model 2: XGBoost (Log1p Target)</w:t>
+            </w:r>
+          </w:p>
+        </w:tc>
+        <w:tc>
+          <w:tcPr>
+            <w:tcW w:type="dxa" w:w="1337"/>
+            <w:tcMar>
+              <w:top w:w="70" w:type="dxa"/>
+              <w:bottom w:w="70" w:type="dxa"/>
+              <w:left w:w="150" w:type="dxa"/>
+              <w:right w:w="150" w:type="dxa"/>
+            </w:tcMar>
+          </w:tcPr>
+          <w:p>
+            <w:r>
+              <w:rPr>
+                <w:sz w:val="18"/>
+              </w:rPr>
+              <w:t>17.91 units</w:t>
+            </w:r>
+          </w:p>
+        </w:tc>
+        <w:tc>
+          <w:tcPr>
+            <w:tcW w:type="dxa" w:w="1337"/>
+            <w:tcMar>
+              <w:top w:w="70" w:type="dxa"/>
+              <w:bottom w:w="70" w:type="dxa"/>
+              <w:left w:w="150" w:type="dxa"/>
+              <w:right w:w="150" w:type="dxa"/>
+            </w:tcMar>
+          </w:tcPr>
+          <w:p>
+            <w:r>
+              <w:rPr>
+                <w:sz w:val="18"/>
+              </w:rPr>
+              <w:t>384.77 units</w:t>
+            </w:r>
+          </w:p>
+        </w:tc>
+        <w:tc>
+          <w:tcPr>
+            <w:tcW w:type="dxa" w:w="1337"/>
+            <w:tcMar>
+              <w:top w:w="70" w:type="dxa"/>
+              <w:bottom w:w="70" w:type="dxa"/>
+              <w:left w:w="150" w:type="dxa"/>
+              <w:right w:w="150" w:type="dxa"/>
+            </w:tcMar>
+          </w:tcPr>
+          <w:p>
+            <w:r>
+              <w:rPr>
+                <w:sz w:val="18"/>
+              </w:rPr>
+              <w:t>156.36%</w:t>
+            </w:r>
+          </w:p>
+        </w:tc>
+        <w:tc>
+          <w:tcPr>
+            <w:tcW w:type="dxa" w:w="1337"/>
+            <w:tcMar>
+              <w:top w:w="70" w:type="dxa"/>
+              <w:bottom w:w="70" w:type="dxa"/>
+              <w:left w:w="150" w:type="dxa"/>
+              <w:right w:w="150" w:type="dxa"/>
+            </w:tcMar>
+          </w:tcPr>
+          <w:p>
+            <w:r>
+              <w:rPr>
+                <w:sz w:val="18"/>
+              </w:rPr>
+              <w:t>0.0017</w:t>
+            </w:r>
+          </w:p>
+        </w:tc>
+        <w:tc>
+          <w:tcPr>
+            <w:tcW w:type="dxa" w:w="1337"/>
+            <w:tcMar>
+              <w:top w:w="70" w:type="dxa"/>
+              <w:bottom w:w="70" w:type="dxa"/>
+              <w:left w:w="150" w:type="dxa"/>
+              <w:right w:w="150" w:type="dxa"/>
+            </w:tcMar>
+            <w:shd w:fill="D4EDDA"/>
+          </w:tcPr>
+          <w:p>
+            <w:r>
+              <w:rPr>
+                <w:b/>
+                <w:sz w:val="18"/>
+              </w:rPr>
+              <w:t>🏆 WINNER (Best MAE)</w:t>
+            </w:r>
+          </w:p>
+        </w:tc>
+      </w:tr>
+      <w:tr>
+        <w:tc>
+          <w:tcPr>
+            <w:tcW w:type="dxa" w:w="1337"/>
+            <w:tcMar>
+              <w:top w:w="70" w:type="dxa"/>
+              <w:bottom w:w="70" w:type="dxa"/>
+              <w:left w:w="150" w:type="dxa"/>
+              <w:right w:w="150" w:type="dxa"/>
+            </w:tcMar>
+            <w:shd w:fill="F8F9FA"/>
+          </w:tcPr>
+          <w:p>
+            <w:r>
+              <w:rPr>
+                <w:sz w:val="18"/>
+              </w:rPr>
+              <w:t>Online Retail</w:t>
+            </w:r>
+          </w:p>
+        </w:tc>
+        <w:tc>
+          <w:tcPr>
+            <w:tcW w:type="dxa" w:w="1337"/>
+            <w:tcMar>
+              <w:top w:w="70" w:type="dxa"/>
+              <w:bottom w:w="70" w:type="dxa"/>
+              <w:left w:w="150" w:type="dxa"/>
+              <w:right w:w="150" w:type="dxa"/>
+            </w:tcMar>
+            <w:shd w:fill="F8F9FA"/>
+          </w:tcPr>
+          <w:p>
+            <w:r>
+              <w:rPr>
+                <w:sz w:val="18"/>
+              </w:rPr>
+              <w:t>Model 3: LightGBM (Standard MSE)</w:t>
+            </w:r>
+          </w:p>
+        </w:tc>
+        <w:tc>
+          <w:tcPr>
+            <w:tcW w:type="dxa" w:w="1337"/>
+            <w:tcMar>
+              <w:top w:w="70" w:type="dxa"/>
+              <w:bottom w:w="70" w:type="dxa"/>
+              <w:left w:w="150" w:type="dxa"/>
+              <w:right w:w="150" w:type="dxa"/>
+            </w:tcMar>
+            <w:shd w:fill="F8F9FA"/>
+          </w:tcPr>
+          <w:p>
+            <w:r>
+              <w:rPr>
+                <w:sz w:val="18"/>
+              </w:rPr>
+              <w:t>20.45 units</w:t>
+            </w:r>
+          </w:p>
+        </w:tc>
+        <w:tc>
+          <w:tcPr>
+            <w:tcW w:type="dxa" w:w="1337"/>
+            <w:tcMar>
+              <w:top w:w="70" w:type="dxa"/>
+              <w:bottom w:w="70" w:type="dxa"/>
+              <w:left w:w="150" w:type="dxa"/>
+              <w:right w:w="150" w:type="dxa"/>
+            </w:tcMar>
+            <w:shd w:fill="F8F9FA"/>
+          </w:tcPr>
+          <w:p>
+            <w:r>
+              <w:rPr>
+                <w:sz w:val="18"/>
+              </w:rPr>
+              <w:t>384.47 units</w:t>
+            </w:r>
+          </w:p>
+        </w:tc>
+        <w:tc>
+          <w:tcPr>
+            <w:tcW w:type="dxa" w:w="1337"/>
+            <w:tcMar>
+              <w:top w:w="70" w:type="dxa"/>
+              <w:bottom w:w="70" w:type="dxa"/>
+              <w:left w:w="150" w:type="dxa"/>
+              <w:right w:w="150" w:type="dxa"/>
+            </w:tcMar>
+            <w:shd w:fill="F8F9FA"/>
+          </w:tcPr>
+          <w:p>
+            <w:r>
+              <w:rPr>
+                <w:sz w:val="18"/>
+              </w:rPr>
+              <w:t>357.02%</w:t>
+            </w:r>
+          </w:p>
+        </w:tc>
+        <w:tc>
+          <w:tcPr>
+            <w:tcW w:type="dxa" w:w="1337"/>
+            <w:tcMar>
+              <w:top w:w="70" w:type="dxa"/>
+              <w:bottom w:w="70" w:type="dxa"/>
+              <w:left w:w="150" w:type="dxa"/>
+              <w:right w:w="150" w:type="dxa"/>
+            </w:tcMar>
+            <w:shd w:fill="F8F9FA"/>
+          </w:tcPr>
+          <w:p>
+            <w:r>
+              <w:rPr>
+                <w:sz w:val="18"/>
+              </w:rPr>
+              <w:t>0.0033</w:t>
             </w:r>
           </w:p>
         </w:tc>
@@ -2711,7 +3001,7 @@
               <w:rPr>
                 <w:sz w:val="18"/>
               </w:rPr>
-              <w:t>0.971 units</w:t>
+              <w:t>0.980 units</w:t>
             </w:r>
           </w:p>
         </w:tc>
@@ -2731,7 +3021,7 @@
               <w:rPr>
                 <w:sz w:val="18"/>
               </w:rPr>
-              <w:t>2.294 units</w:t>
+              <w:t>2.306 units</w:t>
             </w:r>
           </w:p>
         </w:tc>
@@ -2751,7 +3041,7 @@
               <w:rPr>
                 <w:sz w:val="18"/>
               </w:rPr>
-              <w:t>61.81%</w:t>
+              <w:t>62.86%</w:t>
             </w:r>
           </w:p>
         </w:tc>
@@ -2771,7 +3061,7 @@
               <w:rPr>
                 <w:sz w:val="18"/>
               </w:rPr>
-              <w:t>0.3547</w:t>
+              <w:t>0.3482</w:t>
             </w:r>
           </w:p>
         </w:tc>
@@ -2831,7 +3121,7 @@
               <w:rPr>
                 <w:sz w:val="18"/>
               </w:rPr>
-              <w:t>Model 2: XGBoost</w:t>
+              <w:t>Model 2: XGBoost (Squared Error)</w:t>
             </w:r>
           </w:p>
         </w:tc>
@@ -2869,7 +3159,7 @@
               <w:rPr>
                 <w:sz w:val="18"/>
               </w:rPr>
-              <w:t>2.278 units</w:t>
+              <w:t>2.271 units</w:t>
             </w:r>
           </w:p>
         </w:tc>
@@ -2888,7 +3178,7 @@
               <w:rPr>
                 <w:sz w:val="18"/>
               </w:rPr>
-              <w:t>60.67%</w:t>
+              <w:t>60.63%</w:t>
             </w:r>
           </w:p>
         </w:tc>
@@ -2907,7 +3197,7 @@
               <w:rPr>
                 <w:sz w:val="18"/>
               </w:rPr>
-              <w:t>0.3635</w:t>
+              <w:t>0.3676</w:t>
             </w:r>
           </w:p>
         </w:tc>
@@ -2920,15 +3210,13 @@
               <w:left w:w="150" w:type="dxa"/>
               <w:right w:w="150" w:type="dxa"/>
             </w:tcMar>
-            <w:shd w:fill="D4EDDA"/>
           </w:tcPr>
           <w:p>
             <w:r>
               <w:rPr>
-                <w:b/>
                 <w:sz w:val="18"/>
               </w:rPr>
-              <w:t>WINNER (Selected)</w:t>
+              <w:t>Previous Config</w:t>
             </w:r>
           </w:p>
         </w:tc>
@@ -2970,7 +3258,7 @@
               <w:rPr>
                 <w:sz w:val="18"/>
               </w:rPr>
-              <w:t>Model 3: LightGBM</w:t>
+              <w:t>Model 2: XGBoost (Tweedie p=1.5)</w:t>
             </w:r>
           </w:p>
         </w:tc>
@@ -2990,7 +3278,7 @@
               <w:rPr>
                 <w:sz w:val="18"/>
               </w:rPr>
-              <w:t>0.966 units</w:t>
+              <w:t>0.948 units</w:t>
             </w:r>
           </w:p>
         </w:tc>
@@ -3010,7 +3298,7 @@
               <w:rPr>
                 <w:sz w:val="18"/>
               </w:rPr>
-              <w:t>2.281 units</w:t>
+              <w:t>2.257 units</w:t>
             </w:r>
           </w:p>
         </w:tc>
@@ -3030,7 +3318,7 @@
               <w:rPr>
                 <w:sz w:val="18"/>
               </w:rPr>
-              <w:t>60.64%</w:t>
+              <w:t>60.29%</w:t>
             </w:r>
           </w:p>
         </w:tc>
@@ -3050,7 +3338,7 @@
               <w:rPr>
                 <w:sz w:val="18"/>
               </w:rPr>
-              <w:t>0.3618</w:t>
+              <w:t>0.3754</w:t>
             </w:r>
           </w:p>
         </w:tc>
@@ -3063,14 +3351,152 @@
               <w:left w:w="150" w:type="dxa"/>
               <w:right w:w="150" w:type="dxa"/>
             </w:tcMar>
-            <w:shd w:fill="F8F9FA"/>
+            <w:shd w:fill="D4EDDA"/>
+          </w:tcPr>
+          <w:p>
+            <w:r>
+              <w:rPr>
+                <w:b/>
+                <w:sz w:val="18"/>
+              </w:rPr>
+              <w:t>🏆 WINNER (Lowest MAE)</w:t>
+            </w:r>
+          </w:p>
+        </w:tc>
+      </w:tr>
+      <w:tr>
+        <w:tc>
+          <w:tcPr>
+            <w:tcW w:type="dxa" w:w="1337"/>
+            <w:tcMar>
+              <w:top w:w="70" w:type="dxa"/>
+              <w:bottom w:w="70" w:type="dxa"/>
+              <w:left w:w="150" w:type="dxa"/>
+              <w:right w:w="150" w:type="dxa"/>
+            </w:tcMar>
           </w:tcPr>
           <w:p>
             <w:r>
               <w:rPr>
                 <w:sz w:val="18"/>
               </w:rPr>
-              <w:t>Runner-Up</w:t>
+              <w:t>M5 Grocery</w:t>
+            </w:r>
+          </w:p>
+        </w:tc>
+        <w:tc>
+          <w:tcPr>
+            <w:tcW w:type="dxa" w:w="1337"/>
+            <w:tcMar>
+              <w:top w:w="70" w:type="dxa"/>
+              <w:bottom w:w="70" w:type="dxa"/>
+              <w:left w:w="150" w:type="dxa"/>
+              <w:right w:w="150" w:type="dxa"/>
+            </w:tcMar>
+          </w:tcPr>
+          <w:p>
+            <w:r>
+              <w:rPr>
+                <w:sz w:val="18"/>
+              </w:rPr>
+              <w:t>Model 3: LightGBM (Tweedie p=1.5)</w:t>
+            </w:r>
+          </w:p>
+        </w:tc>
+        <w:tc>
+          <w:tcPr>
+            <w:tcW w:type="dxa" w:w="1337"/>
+            <w:tcMar>
+              <w:top w:w="70" w:type="dxa"/>
+              <w:bottom w:w="70" w:type="dxa"/>
+              <w:left w:w="150" w:type="dxa"/>
+              <w:right w:w="150" w:type="dxa"/>
+            </w:tcMar>
+          </w:tcPr>
+          <w:p>
+            <w:r>
+              <w:rPr>
+                <w:sz w:val="18"/>
+              </w:rPr>
+              <w:t>0.952 units</w:t>
+            </w:r>
+          </w:p>
+        </w:tc>
+        <w:tc>
+          <w:tcPr>
+            <w:tcW w:type="dxa" w:w="1337"/>
+            <w:tcMar>
+              <w:top w:w="70" w:type="dxa"/>
+              <w:bottom w:w="70" w:type="dxa"/>
+              <w:left w:w="150" w:type="dxa"/>
+              <w:right w:w="150" w:type="dxa"/>
+            </w:tcMar>
+          </w:tcPr>
+          <w:p>
+            <w:r>
+              <w:rPr>
+                <w:sz w:val="18"/>
+              </w:rPr>
+              <w:t>2.258 units</w:t>
+            </w:r>
+          </w:p>
+        </w:tc>
+        <w:tc>
+          <w:tcPr>
+            <w:tcW w:type="dxa" w:w="1337"/>
+            <w:tcMar>
+              <w:top w:w="70" w:type="dxa"/>
+              <w:bottom w:w="70" w:type="dxa"/>
+              <w:left w:w="150" w:type="dxa"/>
+              <w:right w:w="150" w:type="dxa"/>
+            </w:tcMar>
+          </w:tcPr>
+          <w:p>
+            <w:r>
+              <w:rPr>
+                <w:sz w:val="18"/>
+              </w:rPr>
+              <w:t>60.43%</w:t>
+            </w:r>
+          </w:p>
+        </w:tc>
+        <w:tc>
+          <w:tcPr>
+            <w:tcW w:type="dxa" w:w="1337"/>
+            <w:tcMar>
+              <w:top w:w="70" w:type="dxa"/>
+              <w:bottom w:w="70" w:type="dxa"/>
+              <w:left w:w="150" w:type="dxa"/>
+              <w:right w:w="150" w:type="dxa"/>
+            </w:tcMar>
+          </w:tcPr>
+          <w:p>
+            <w:r>
+              <w:rPr>
+                <w:sz w:val="18"/>
+              </w:rPr>
+              <w:t>0.3749</w:t>
+            </w:r>
+          </w:p>
+        </w:tc>
+        <w:tc>
+          <w:tcPr>
+            <w:tcW w:type="dxa" w:w="1337"/>
+            <w:tcMar>
+              <w:top w:w="70" w:type="dxa"/>
+              <w:bottom w:w="70" w:type="dxa"/>
+              <w:left w:w="150" w:type="dxa"/>
+              <w:right w:w="150" w:type="dxa"/>
+            </w:tcMar>
+            <w:shd w:fill="D4EDDA"/>
+          </w:tcPr>
+          <w:p>
+            <w:r>
+              <w:rPr>
+                <w:b/>
+                <w:sz w:val="18"/>
+              </w:rPr>
+              <w:t>🏆 WINNER (Lowest RMSE &amp; R²)</w:t>
             </w:r>
           </w:p>
         </w:tc>
@@ -3103,7 +3529,7 @@
       <w:r>
         <w:drawing>
           <wp:inline xmlns:a="http://schemas.openxmlformats.org/drawingml/2006/main" xmlns:pic="http://schemas.openxmlformats.org/drawingml/2006/picture">
-            <wp:extent cx="5943600" cy="1755550"/>
+            <wp:extent cx="5943600" cy="1755157"/>
             <wp:docPr id="2" name="Picture 2"/>
             <wp:cNvGraphicFramePr>
               <a:graphicFrameLocks noChangeAspect="1"/>
@@ -3124,7 +3550,7 @@
                   <pic:spPr>
                     <a:xfrm>
                       <a:off x="0" y="0"/>
-                      <a:ext cx="5943600" cy="1755550"/>
+                      <a:ext cx="5943600" cy="1755157"/>
                     </a:xfrm>
                     <a:prstGeom prst="rect"/>
                   </pic:spPr>
@@ -3416,7 +3842,7 @@
               <w:rPr>
                 <w:sz w:val="18"/>
               </w:rPr>
-              <w:t>$1,602,595 / wk</w:t>
+              <w:t>$1,560,285 / wk</w:t>
             </w:r>
           </w:p>
         </w:tc>
@@ -3435,7 +3861,7 @@
               <w:rPr>
                 <w:sz w:val="18"/>
               </w:rPr>
-              <w:t>$171,235</w:t>
+              <w:t>$172,541</w:t>
             </w:r>
           </w:p>
         </w:tc>
@@ -3473,7 +3899,7 @@
               <w:rPr>
                 <w:sz w:val="18"/>
               </w:rPr>
-              <w:t>$398,359</w:t>
+              <w:t>$401,397</w:t>
             </w:r>
           </w:p>
         </w:tc>
@@ -3492,7 +3918,7 @@
               <w:rPr>
                 <w:sz w:val="18"/>
               </w:rPr>
-              <w:t>$3,603,550</w:t>
+              <w:t>$3,521,966</w:t>
             </w:r>
           </w:p>
         </w:tc>
@@ -3511,7 +3937,7 @@
               <w:rPr>
                 <w:sz w:val="18"/>
               </w:rPr>
-              <w:t>$745,363</w:t>
+              <w:t>$735,458</w:t>
             </w:r>
           </w:p>
         </w:tc>
@@ -3573,7 +3999,7 @@
               <w:rPr>
                 <w:sz w:val="18"/>
               </w:rPr>
-              <w:t>$2,195,993 / wk</w:t>
+              <w:t>$2,180,120 / wk</w:t>
             </w:r>
           </w:p>
         </w:tc>
@@ -3593,7 +4019,7 @@
               <w:rPr>
                 <w:sz w:val="18"/>
               </w:rPr>
-              <w:t>$298,567</w:t>
+              <w:t>$299,858</w:t>
             </w:r>
           </w:p>
         </w:tc>
@@ -3633,7 +4059,7 @@
               <w:rPr>
                 <w:sz w:val="18"/>
               </w:rPr>
-              <w:t>$694,580</w:t>
+              <w:t>$697,584</w:t>
             </w:r>
           </w:p>
         </w:tc>
@@ -3653,7 +4079,7 @@
               <w:rPr>
                 <w:sz w:val="18"/>
               </w:rPr>
-              <w:t>$5,086,566</w:t>
+              <w:t>$5,057,824</w:t>
             </w:r>
           </w:p>
         </w:tc>
@@ -3673,7 +4099,7 @@
               <w:rPr>
                 <w:sz w:val="18"/>
               </w:rPr>
-              <w:t>$872,512</w:t>
+              <w:t>$869,353</w:t>
             </w:r>
           </w:p>
         </w:tc>
@@ -3732,7 +4158,7 @@
               <w:rPr>
                 <w:sz w:val="18"/>
               </w:rPr>
-              <w:t>$1,846,357 / wk</w:t>
+              <w:t>$1,796,927 / wk</w:t>
             </w:r>
           </w:p>
         </w:tc>
@@ -3751,7 +4177,7 @@
               <w:rPr>
                 <w:sz w:val="18"/>
               </w:rPr>
-              <w:t>$331,594</w:t>
+              <w:t>$336,422</w:t>
             </w:r>
           </w:p>
         </w:tc>
@@ -3789,7 +4215,7 @@
               <w:rPr>
                 <w:sz w:val="18"/>
               </w:rPr>
-              <w:t>$771,415</w:t>
+              <w:t>$782,647</w:t>
             </w:r>
           </w:p>
         </w:tc>
@@ -3808,7 +4234,7 @@
               <w:rPr>
                 <w:sz w:val="18"/>
               </w:rPr>
-              <w:t>$4,464,129</w:t>
+              <w:t>$4,376,501</w:t>
             </w:r>
           </w:p>
         </w:tc>
@@ -3827,7 +4253,323 @@
               <w:rPr>
                 <w:sz w:val="18"/>
               </w:rPr>
-              <w:t>$800,044</w:t>
+              <w:t>$789,262</w:t>
+            </w:r>
+          </w:p>
+        </w:tc>
+      </w:tr>
+      <w:tr>
+        <w:tc>
+          <w:tcPr>
+            <w:tcW w:type="dxa" w:w="1170"/>
+            <w:tcMar>
+              <w:top w:w="70" w:type="dxa"/>
+              <w:bottom w:w="70" w:type="dxa"/>
+              <w:left w:w="150" w:type="dxa"/>
+              <w:right w:w="150" w:type="dxa"/>
+            </w:tcMar>
+            <w:shd w:fill="F8F9FA"/>
+          </w:tcPr>
+          <w:p>
+            <w:r>
+              <w:rPr>
+                <w:sz w:val="18"/>
+              </w:rPr>
+              <w:t>Walmart</w:t>
+            </w:r>
+          </w:p>
+        </w:tc>
+        <w:tc>
+          <w:tcPr>
+            <w:tcW w:type="dxa" w:w="1170"/>
+            <w:tcMar>
+              <w:top w:w="70" w:type="dxa"/>
+              <w:bottom w:w="70" w:type="dxa"/>
+              <w:left w:w="150" w:type="dxa"/>
+              <w:right w:w="150" w:type="dxa"/>
+            </w:tcMar>
+            <w:shd w:fill="F8F9FA"/>
+          </w:tcPr>
+          <w:p>
+            <w:r>
+              <w:rPr>
+                <w:sz w:val="18"/>
+              </w:rPr>
+              <w:t>Store 20</w:t>
+            </w:r>
+          </w:p>
+        </w:tc>
+        <w:tc>
+          <w:tcPr>
+            <w:tcW w:type="dxa" w:w="1170"/>
+            <w:tcMar>
+              <w:top w:w="70" w:type="dxa"/>
+              <w:bottom w:w="70" w:type="dxa"/>
+              <w:left w:w="150" w:type="dxa"/>
+              <w:right w:w="150" w:type="dxa"/>
+            </w:tcMar>
+            <w:shd w:fill="F8F9FA"/>
+          </w:tcPr>
+          <w:p>
+            <w:r>
+              <w:rPr>
+                <w:sz w:val="18"/>
+              </w:rPr>
+              <w:t>$2,053,437 / wk</w:t>
+            </w:r>
+          </w:p>
+        </w:tc>
+        <w:tc>
+          <w:tcPr>
+            <w:tcW w:type="dxa" w:w="1170"/>
+            <w:tcMar>
+              <w:top w:w="70" w:type="dxa"/>
+              <w:bottom w:w="70" w:type="dxa"/>
+              <w:left w:w="150" w:type="dxa"/>
+              <w:right w:w="150" w:type="dxa"/>
+            </w:tcMar>
+            <w:shd w:fill="F8F9FA"/>
+          </w:tcPr>
+          <w:p>
+            <w:r>
+              <w:rPr>
+                <w:sz w:val="18"/>
+              </w:rPr>
+              <w:t>$310,349</w:t>
+            </w:r>
+          </w:p>
+        </w:tc>
+        <w:tc>
+          <w:tcPr>
+            <w:tcW w:type="dxa" w:w="1170"/>
+            <w:tcMar>
+              <w:top w:w="70" w:type="dxa"/>
+              <w:bottom w:w="70" w:type="dxa"/>
+              <w:left w:w="150" w:type="dxa"/>
+              <w:right w:w="150" w:type="dxa"/>
+            </w:tcMar>
+            <w:shd w:fill="F8F9FA"/>
+          </w:tcPr>
+          <w:p>
+            <w:r>
+              <w:rPr>
+                <w:sz w:val="18"/>
+              </w:rPr>
+              <w:t>2 weeks</w:t>
+            </w:r>
+          </w:p>
+        </w:tc>
+        <w:tc>
+          <w:tcPr>
+            <w:tcW w:type="dxa" w:w="1170"/>
+            <w:tcMar>
+              <w:top w:w="70" w:type="dxa"/>
+              <w:bottom w:w="70" w:type="dxa"/>
+              <w:left w:w="150" w:type="dxa"/>
+              <w:right w:w="150" w:type="dxa"/>
+            </w:tcMar>
+            <w:shd w:fill="F8F9FA"/>
+          </w:tcPr>
+          <w:p>
+            <w:r>
+              <w:rPr>
+                <w:sz w:val="18"/>
+              </w:rPr>
+              <w:t>$721,990</w:t>
+            </w:r>
+          </w:p>
+        </w:tc>
+        <w:tc>
+          <w:tcPr>
+            <w:tcW w:type="dxa" w:w="1170"/>
+            <w:tcMar>
+              <w:top w:w="70" w:type="dxa"/>
+              <w:bottom w:w="70" w:type="dxa"/>
+              <w:left w:w="150" w:type="dxa"/>
+              <w:right w:w="150" w:type="dxa"/>
+            </w:tcMar>
+            <w:shd w:fill="F8F9FA"/>
+          </w:tcPr>
+          <w:p>
+            <w:r>
+              <w:rPr>
+                <w:sz w:val="18"/>
+              </w:rPr>
+              <w:t>$4,828,864</w:t>
+            </w:r>
+          </w:p>
+        </w:tc>
+        <w:tc>
+          <w:tcPr>
+            <w:tcW w:type="dxa" w:w="1170"/>
+            <w:tcMar>
+              <w:top w:w="70" w:type="dxa"/>
+              <w:bottom w:w="70" w:type="dxa"/>
+              <w:left w:w="150" w:type="dxa"/>
+              <w:right w:w="150" w:type="dxa"/>
+            </w:tcMar>
+            <w:shd w:fill="F8F9FA"/>
+          </w:tcPr>
+          <w:p>
+            <w:r>
+              <w:rPr>
+                <w:sz w:val="18"/>
+              </w:rPr>
+              <w:t>$843,717</w:t>
+            </w:r>
+          </w:p>
+        </w:tc>
+      </w:tr>
+      <w:tr>
+        <w:tc>
+          <w:tcPr>
+            <w:tcW w:type="dxa" w:w="1170"/>
+            <w:tcMar>
+              <w:top w:w="70" w:type="dxa"/>
+              <w:bottom w:w="70" w:type="dxa"/>
+              <w:left w:w="150" w:type="dxa"/>
+              <w:right w:w="150" w:type="dxa"/>
+            </w:tcMar>
+          </w:tcPr>
+          <w:p>
+            <w:r>
+              <w:rPr>
+                <w:sz w:val="18"/>
+              </w:rPr>
+              <w:t>Walmart</w:t>
+            </w:r>
+          </w:p>
+        </w:tc>
+        <w:tc>
+          <w:tcPr>
+            <w:tcW w:type="dxa" w:w="1170"/>
+            <w:tcMar>
+              <w:top w:w="70" w:type="dxa"/>
+              <w:bottom w:w="70" w:type="dxa"/>
+              <w:left w:w="150" w:type="dxa"/>
+              <w:right w:w="150" w:type="dxa"/>
+            </w:tcMar>
+          </w:tcPr>
+          <w:p>
+            <w:r>
+              <w:rPr>
+                <w:sz w:val="18"/>
+              </w:rPr>
+              <w:t>Store 33</w:t>
+            </w:r>
+          </w:p>
+        </w:tc>
+        <w:tc>
+          <w:tcPr>
+            <w:tcW w:type="dxa" w:w="1170"/>
+            <w:tcMar>
+              <w:top w:w="70" w:type="dxa"/>
+              <w:bottom w:w="70" w:type="dxa"/>
+              <w:left w:w="150" w:type="dxa"/>
+              <w:right w:w="150" w:type="dxa"/>
+            </w:tcMar>
+          </w:tcPr>
+          <w:p>
+            <w:r>
+              <w:rPr>
+                <w:sz w:val="18"/>
+              </w:rPr>
+              <w:t>$273,114 / wk</w:t>
+            </w:r>
+          </w:p>
+        </w:tc>
+        <w:tc>
+          <w:tcPr>
+            <w:tcW w:type="dxa" w:w="1170"/>
+            <w:tcMar>
+              <w:top w:w="70" w:type="dxa"/>
+              <w:bottom w:w="70" w:type="dxa"/>
+              <w:left w:w="150" w:type="dxa"/>
+              <w:right w:w="150" w:type="dxa"/>
+            </w:tcMar>
+          </w:tcPr>
+          <w:p>
+            <w:r>
+              <w:rPr>
+                <w:sz w:val="18"/>
+              </w:rPr>
+              <w:t>$24,480</w:t>
+            </w:r>
+          </w:p>
+        </w:tc>
+        <w:tc>
+          <w:tcPr>
+            <w:tcW w:type="dxa" w:w="1170"/>
+            <w:tcMar>
+              <w:top w:w="70" w:type="dxa"/>
+              <w:bottom w:w="70" w:type="dxa"/>
+              <w:left w:w="150" w:type="dxa"/>
+              <w:right w:w="150" w:type="dxa"/>
+            </w:tcMar>
+          </w:tcPr>
+          <w:p>
+            <w:r>
+              <w:rPr>
+                <w:sz w:val="18"/>
+              </w:rPr>
+              <w:t>2 weeks</w:t>
+            </w:r>
+          </w:p>
+        </w:tc>
+        <w:tc>
+          <w:tcPr>
+            <w:tcW w:type="dxa" w:w="1170"/>
+            <w:tcMar>
+              <w:top w:w="70" w:type="dxa"/>
+              <w:bottom w:w="70" w:type="dxa"/>
+              <w:left w:w="150" w:type="dxa"/>
+              <w:right w:w="150" w:type="dxa"/>
+            </w:tcMar>
+          </w:tcPr>
+          <w:p>
+            <w:r>
+              <w:rPr>
+                <w:sz w:val="18"/>
+              </w:rPr>
+              <w:t>$56,951</w:t>
+            </w:r>
+          </w:p>
+        </w:tc>
+        <w:tc>
+          <w:tcPr>
+            <w:tcW w:type="dxa" w:w="1170"/>
+            <w:tcMar>
+              <w:top w:w="70" w:type="dxa"/>
+              <w:bottom w:w="70" w:type="dxa"/>
+              <w:left w:w="150" w:type="dxa"/>
+              <w:right w:w="150" w:type="dxa"/>
+            </w:tcMar>
+          </w:tcPr>
+          <w:p>
+            <w:r>
+              <w:rPr>
+                <w:sz w:val="18"/>
+              </w:rPr>
+              <w:t>$603,180</w:t>
+            </w:r>
+          </w:p>
+        </w:tc>
+        <w:tc>
+          <w:tcPr>
+            <w:tcW w:type="dxa" w:w="1170"/>
+            <w:tcMar>
+              <w:top w:w="70" w:type="dxa"/>
+              <w:bottom w:w="70" w:type="dxa"/>
+              <w:left w:w="150" w:type="dxa"/>
+              <w:right w:w="150" w:type="dxa"/>
+            </w:tcMar>
+          </w:tcPr>
+          <w:p>
+            <w:r>
+              <w:rPr>
+                <w:sz w:val="18"/>
+              </w:rPr>
+              <w:t>$307,701</w:t>
             </w:r>
           </w:p>
         </w:tc>
@@ -3889,7 +4631,7 @@
               <w:rPr>
                 <w:sz w:val="18"/>
               </w:rPr>
-              <w:t>150.6 u / day</w:t>
+              <w:t>137.0 u / day</w:t>
             </w:r>
           </w:p>
         </w:tc>
@@ -3969,7 +4711,7 @@
               <w:rPr>
                 <w:sz w:val="18"/>
               </w:rPr>
-              <w:t>2,118.2 units</w:t>
+              <w:t>2,023.0 units</w:t>
             </w:r>
           </w:p>
         </w:tc>
@@ -3989,7 +4731,7 @@
               <w:rPr>
                 <w:sz w:val="18"/>
               </w:rPr>
-              <w:t>1,875.8 units</w:t>
+              <w:t>1,789.1 units</w:t>
             </w:r>
           </w:p>
         </w:tc>
@@ -4048,7 +4790,7 @@
               <w:rPr>
                 <w:sz w:val="18"/>
               </w:rPr>
-              <w:t>191.8 u / day</w:t>
+              <w:t>150.2 u / day</w:t>
             </w:r>
           </w:p>
         </w:tc>
@@ -4124,7 +4866,7 @@
               <w:rPr>
                 <w:sz w:val="18"/>
               </w:rPr>
-              <w:t>2,131.7 units</w:t>
+              <w:t>1,840.7 units</w:t>
             </w:r>
           </w:p>
         </w:tc>
@@ -4143,7 +4885,7 @@
               <w:rPr>
                 <w:sz w:val="18"/>
               </w:rPr>
-              <w:t>2,366.7 units</w:t>
+              <w:t>2,094.5 units</w:t>
             </w:r>
           </w:p>
         </w:tc>
@@ -4205,7 +4947,7 @@
               <w:rPr>
                 <w:sz w:val="18"/>
               </w:rPr>
-              <w:t>0.98 u / day</w:t>
+              <w:t>0.99 u / day</w:t>
             </w:r>
           </w:p>
         </w:tc>
@@ -4285,7 +5027,7 @@
               <w:rPr>
                 <w:sz w:val="18"/>
               </w:rPr>
-              <w:t>10.96 units</w:t>
+              <w:t>11.00 units</w:t>
             </w:r>
           </w:p>
         </w:tc>
@@ -4305,7 +5047,7 @@
               <w:rPr>
                 <w:sz w:val="18"/>
               </w:rPr>
-              <w:t>80.78 units</w:t>
+              <w:t>81.00 units</w:t>
             </w:r>
           </w:p>
         </w:tc>
@@ -4364,7 +5106,7 @@
               <w:rPr>
                 <w:sz w:val="18"/>
               </w:rPr>
-              <w:t>0.25 u / day</w:t>
+              <w:t>0.26 u / day</w:t>
             </w:r>
           </w:p>
         </w:tc>
@@ -4440,7 +5182,7 @@
               <w:rPr>
                 <w:sz w:val="18"/>
               </w:rPr>
-              <w:t>4.92 units</w:t>
+              <w:t>5.00 units</w:t>
             </w:r>
           </w:p>
         </w:tc>
@@ -4459,7 +5201,7 @@
               <w:rPr>
                 <w:sz w:val="18"/>
               </w:rPr>
-              <w:t>58.16 units</w:t>
+              <w:t>59.51 units</w:t>
             </w:r>
           </w:p>
         </w:tc>
@@ -4501,7 +5243,7 @@
               <w:rPr>
                 <w:sz w:val="18"/>
               </w:rPr>
-              <w:t>HOBBIES_1_004</w:t>
+              <w:t>HOBBIES_1_003</w:t>
             </w:r>
           </w:p>
         </w:tc>
@@ -4521,7 +5263,7 @@
               <w:rPr>
                 <w:sz w:val="18"/>
               </w:rPr>
-              <w:t>1.81 u / day</w:t>
+              <w:t>0.42 u / day</w:t>
             </w:r>
           </w:p>
         </w:tc>
@@ -4541,7 +5283,7 @@
               <w:rPr>
                 <w:sz w:val="18"/>
               </w:rPr>
-              <w:t>2.17</w:t>
+              <w:t>0.89</w:t>
             </w:r>
           </w:p>
         </w:tc>
@@ -4581,7 +5323,7 @@
               <w:rPr>
                 <w:sz w:val="18"/>
               </w:rPr>
-              <w:t>9.45 units</w:t>
+              <w:t>3.88 units</w:t>
             </w:r>
           </w:p>
         </w:tc>
@@ -4601,7 +5343,7 @@
               <w:rPr>
                 <w:sz w:val="18"/>
               </w:rPr>
-              <w:t>22.11 units</w:t>
+              <w:t>6.83 units</w:t>
             </w:r>
           </w:p>
         </w:tc>
@@ -4621,7 +5363,323 @@
               <w:rPr>
                 <w:sz w:val="18"/>
               </w:rPr>
-              <w:t>146.06 units</w:t>
+              <w:t>88.11 units</w:t>
+            </w:r>
+          </w:p>
+        </w:tc>
+      </w:tr>
+      <w:tr>
+        <w:tc>
+          <w:tcPr>
+            <w:tcW w:type="dxa" w:w="1170"/>
+            <w:tcMar>
+              <w:top w:w="70" w:type="dxa"/>
+              <w:bottom w:w="70" w:type="dxa"/>
+              <w:left w:w="150" w:type="dxa"/>
+              <w:right w:w="150" w:type="dxa"/>
+            </w:tcMar>
+          </w:tcPr>
+          <w:p>
+            <w:r>
+              <w:rPr>
+                <w:sz w:val="18"/>
+              </w:rPr>
+              <w:t>M5 Grocery</w:t>
+            </w:r>
+          </w:p>
+        </w:tc>
+        <w:tc>
+          <w:tcPr>
+            <w:tcW w:type="dxa" w:w="1170"/>
+            <w:tcMar>
+              <w:top w:w="70" w:type="dxa"/>
+              <w:bottom w:w="70" w:type="dxa"/>
+              <w:left w:w="150" w:type="dxa"/>
+              <w:right w:w="150" w:type="dxa"/>
+            </w:tcMar>
+          </w:tcPr>
+          <w:p>
+            <w:r>
+              <w:rPr>
+                <w:sz w:val="18"/>
+              </w:rPr>
+              <w:t>HOBBIES_1_004</w:t>
+            </w:r>
+          </w:p>
+        </w:tc>
+        <w:tc>
+          <w:tcPr>
+            <w:tcW w:type="dxa" w:w="1170"/>
+            <w:tcMar>
+              <w:top w:w="70" w:type="dxa"/>
+              <w:bottom w:w="70" w:type="dxa"/>
+              <w:left w:w="150" w:type="dxa"/>
+              <w:right w:w="150" w:type="dxa"/>
+            </w:tcMar>
+          </w:tcPr>
+          <w:p>
+            <w:r>
+              <w:rPr>
+                <w:sz w:val="18"/>
+              </w:rPr>
+              <w:t>1.78 u / day</w:t>
+            </w:r>
+          </w:p>
+        </w:tc>
+        <w:tc>
+          <w:tcPr>
+            <w:tcW w:type="dxa" w:w="1170"/>
+            <w:tcMar>
+              <w:top w:w="70" w:type="dxa"/>
+              <w:bottom w:w="70" w:type="dxa"/>
+              <w:left w:w="150" w:type="dxa"/>
+              <w:right w:w="150" w:type="dxa"/>
+            </w:tcMar>
+          </w:tcPr>
+          <w:p>
+            <w:r>
+              <w:rPr>
+                <w:sz w:val="18"/>
+              </w:rPr>
+              <w:t>2.17</w:t>
+            </w:r>
+          </w:p>
+        </w:tc>
+        <w:tc>
+          <w:tcPr>
+            <w:tcW w:type="dxa" w:w="1170"/>
+            <w:tcMar>
+              <w:top w:w="70" w:type="dxa"/>
+              <w:bottom w:w="70" w:type="dxa"/>
+              <w:left w:w="150" w:type="dxa"/>
+              <w:right w:w="150" w:type="dxa"/>
+            </w:tcMar>
+          </w:tcPr>
+          <w:p>
+            <w:r>
+              <w:rPr>
+                <w:sz w:val="18"/>
+              </w:rPr>
+              <w:t>7 days</w:t>
+            </w:r>
+          </w:p>
+        </w:tc>
+        <w:tc>
+          <w:tcPr>
+            <w:tcW w:type="dxa" w:w="1170"/>
+            <w:tcMar>
+              <w:top w:w="70" w:type="dxa"/>
+              <w:bottom w:w="70" w:type="dxa"/>
+              <w:left w:w="150" w:type="dxa"/>
+              <w:right w:w="150" w:type="dxa"/>
+            </w:tcMar>
+          </w:tcPr>
+          <w:p>
+            <w:r>
+              <w:rPr>
+                <w:sz w:val="18"/>
+              </w:rPr>
+              <w:t>9.45 units</w:t>
+            </w:r>
+          </w:p>
+        </w:tc>
+        <w:tc>
+          <w:tcPr>
+            <w:tcW w:type="dxa" w:w="1170"/>
+            <w:tcMar>
+              <w:top w:w="70" w:type="dxa"/>
+              <w:bottom w:w="70" w:type="dxa"/>
+              <w:left w:w="150" w:type="dxa"/>
+              <w:right w:w="150" w:type="dxa"/>
+            </w:tcMar>
+          </w:tcPr>
+          <w:p>
+            <w:r>
+              <w:rPr>
+                <w:sz w:val="18"/>
+              </w:rPr>
+              <w:t>21.91 units</w:t>
+            </w:r>
+          </w:p>
+        </w:tc>
+        <w:tc>
+          <w:tcPr>
+            <w:tcW w:type="dxa" w:w="1170"/>
+            <w:tcMar>
+              <w:top w:w="70" w:type="dxa"/>
+              <w:bottom w:w="70" w:type="dxa"/>
+              <w:left w:w="150" w:type="dxa"/>
+              <w:right w:w="150" w:type="dxa"/>
+            </w:tcMar>
+          </w:tcPr>
+          <w:p>
+            <w:r>
+              <w:rPr>
+                <w:sz w:val="18"/>
+              </w:rPr>
+              <w:t>144.89 units</w:t>
+            </w:r>
+          </w:p>
+        </w:tc>
+      </w:tr>
+      <w:tr>
+        <w:tc>
+          <w:tcPr>
+            <w:tcW w:type="dxa" w:w="1170"/>
+            <w:tcMar>
+              <w:top w:w="70" w:type="dxa"/>
+              <w:bottom w:w="70" w:type="dxa"/>
+              <w:left w:w="150" w:type="dxa"/>
+              <w:right w:w="150" w:type="dxa"/>
+            </w:tcMar>
+            <w:shd w:fill="F8F9FA"/>
+          </w:tcPr>
+          <w:p>
+            <w:r>
+              <w:rPr>
+                <w:sz w:val="18"/>
+              </w:rPr>
+              <w:t>M5 Grocery</w:t>
+            </w:r>
+          </w:p>
+        </w:tc>
+        <w:tc>
+          <w:tcPr>
+            <w:tcW w:type="dxa" w:w="1170"/>
+            <w:tcMar>
+              <w:top w:w="70" w:type="dxa"/>
+              <w:bottom w:w="70" w:type="dxa"/>
+              <w:left w:w="150" w:type="dxa"/>
+              <w:right w:w="150" w:type="dxa"/>
+            </w:tcMar>
+            <w:shd w:fill="F8F9FA"/>
+          </w:tcPr>
+          <w:p>
+            <w:r>
+              <w:rPr>
+                <w:sz w:val="18"/>
+              </w:rPr>
+              <w:t>HOBBIES_1_005</w:t>
+            </w:r>
+          </w:p>
+        </w:tc>
+        <w:tc>
+          <w:tcPr>
+            <w:tcW w:type="dxa" w:w="1170"/>
+            <w:tcMar>
+              <w:top w:w="70" w:type="dxa"/>
+              <w:bottom w:w="70" w:type="dxa"/>
+              <w:left w:w="150" w:type="dxa"/>
+              <w:right w:w="150" w:type="dxa"/>
+            </w:tcMar>
+            <w:shd w:fill="F8F9FA"/>
+          </w:tcPr>
+          <w:p>
+            <w:r>
+              <w:rPr>
+                <w:sz w:val="18"/>
+              </w:rPr>
+              <w:t>1.12 u / day</w:t>
+            </w:r>
+          </w:p>
+        </w:tc>
+        <w:tc>
+          <w:tcPr>
+            <w:tcW w:type="dxa" w:w="1170"/>
+            <w:tcMar>
+              <w:top w:w="70" w:type="dxa"/>
+              <w:bottom w:w="70" w:type="dxa"/>
+              <w:left w:w="150" w:type="dxa"/>
+              <w:right w:w="150" w:type="dxa"/>
+            </w:tcMar>
+            <w:shd w:fill="F8F9FA"/>
+          </w:tcPr>
+          <w:p>
+            <w:r>
+              <w:rPr>
+                <w:sz w:val="18"/>
+              </w:rPr>
+              <w:t>1.19</w:t>
+            </w:r>
+          </w:p>
+        </w:tc>
+        <w:tc>
+          <w:tcPr>
+            <w:tcW w:type="dxa" w:w="1170"/>
+            <w:tcMar>
+              <w:top w:w="70" w:type="dxa"/>
+              <w:bottom w:w="70" w:type="dxa"/>
+              <w:left w:w="150" w:type="dxa"/>
+              <w:right w:w="150" w:type="dxa"/>
+            </w:tcMar>
+            <w:shd w:fill="F8F9FA"/>
+          </w:tcPr>
+          <w:p>
+            <w:r>
+              <w:rPr>
+                <w:sz w:val="18"/>
+              </w:rPr>
+              <w:t>7 days</w:t>
+            </w:r>
+          </w:p>
+        </w:tc>
+        <w:tc>
+          <w:tcPr>
+            <w:tcW w:type="dxa" w:w="1170"/>
+            <w:tcMar>
+              <w:top w:w="70" w:type="dxa"/>
+              <w:bottom w:w="70" w:type="dxa"/>
+              <w:left w:w="150" w:type="dxa"/>
+              <w:right w:w="150" w:type="dxa"/>
+            </w:tcMar>
+            <w:shd w:fill="F8F9FA"/>
+          </w:tcPr>
+          <w:p>
+            <w:r>
+              <w:rPr>
+                <w:sz w:val="18"/>
+              </w:rPr>
+              <w:t>5.17 units</w:t>
+            </w:r>
+          </w:p>
+        </w:tc>
+        <w:tc>
+          <w:tcPr>
+            <w:tcW w:type="dxa" w:w="1170"/>
+            <w:tcMar>
+              <w:top w:w="70" w:type="dxa"/>
+              <w:bottom w:w="70" w:type="dxa"/>
+              <w:left w:w="150" w:type="dxa"/>
+              <w:right w:w="150" w:type="dxa"/>
+            </w:tcMar>
+            <w:shd w:fill="F8F9FA"/>
+          </w:tcPr>
+          <w:p>
+            <w:r>
+              <w:rPr>
+                <w:sz w:val="18"/>
+              </w:rPr>
+              <w:t>13.00 units</w:t>
+            </w:r>
+          </w:p>
+        </w:tc>
+        <w:tc>
+          <w:tcPr>
+            <w:tcW w:type="dxa" w:w="1170"/>
+            <w:tcMar>
+              <w:top w:w="70" w:type="dxa"/>
+              <w:bottom w:w="70" w:type="dxa"/>
+              <w:left w:w="150" w:type="dxa"/>
+              <w:right w:w="150" w:type="dxa"/>
+            </w:tcMar>
+            <w:shd w:fill="F8F9FA"/>
+          </w:tcPr>
+          <w:p>
+            <w:r>
+              <w:rPr>
+                <w:sz w:val="18"/>
+              </w:rPr>
+              <w:t>145.90 units</w:t>
             </w:r>
           </w:p>
         </w:tc>
@@ -4674,7 +5732,7 @@
       <w:r>
         <w:drawing>
           <wp:inline xmlns:a="http://schemas.openxmlformats.org/drawingml/2006/main" xmlns:pic="http://schemas.openxmlformats.org/drawingml/2006/picture">
-            <wp:extent cx="5943600" cy="3378017"/>
+            <wp:extent cx="5943600" cy="3376592"/>
             <wp:docPr id="3" name="Picture 3"/>
             <wp:cNvGraphicFramePr>
               <a:graphicFrameLocks noChangeAspect="1"/>
@@ -4695,7 +5753,7 @@
                   <pic:spPr>
                     <a:xfrm>
                       <a:off x="0" y="0"/>
-                      <a:ext cx="5943600" cy="3378017"/>
+                      <a:ext cx="5943600" cy="3376592"/>
                     </a:xfrm>
                     <a:prstGeom prst="rect"/>
                   </pic:spPr>
@@ -4728,7 +5786,7 @@
       <w:r>
         <w:drawing>
           <wp:inline xmlns:a="http://schemas.openxmlformats.org/drawingml/2006/main" xmlns:pic="http://schemas.openxmlformats.org/drawingml/2006/picture">
-            <wp:extent cx="5943600" cy="2095728"/>
+            <wp:extent cx="5943600" cy="2093801"/>
             <wp:docPr id="4" name="Picture 4"/>
             <wp:cNvGraphicFramePr>
               <a:graphicFrameLocks noChangeAspect="1"/>
@@ -4749,7 +5807,7 @@
                   <pic:spPr>
                     <a:xfrm>
                       <a:off x="0" y="0"/>
-                      <a:ext cx="5943600" cy="2095728"/>
+                      <a:ext cx="5943600" cy="2093801"/>
                     </a:xfrm>
                     <a:prstGeom prst="rect"/>
                   </pic:spPr>
@@ -4770,7 +5828,7 @@
           <w:i/>
           <w:sz w:val="19"/>
         </w:rPr>
-        <w:t>Figure 4: Inventory Control Dynamics: (A) Reorder Point &amp; Safety Stock Buffers, (B) Safety Stock vs EOQ Lot Sizing.</w:t>
+        <w:t>Figure 4: Inventory Control Dynamics: (A) Dynamic Reorder Thresholds, (B) Offline Trigg's Tracking Signal Drift Monitoring.</w:t>
       </w:r>
     </w:p>
     <w:p>
@@ -4790,7 +5848,7 @@
     </w:p>
     <w:p>
       <w:r>
-        <w:t>This research addressed the persistent divide between machine learning demand forecasting and supply chain inventory control. By developing an end-to-end framework evaluated across three diverse retail tiers—Walmart store panels, Online Retail e-commerce transactions, and the M5 grocery benchmark—we demonstrated that gradient boosted tree architectures (XGBoost and LightGBM) deliver substantial predictive improvements over traditional persistence baselines, reducing out-of-sample RMSE by up to 28.9%.</w:t>
+        <w:t>This research addressed the persistent divide between machine learning demand forecasting and supply chain inventory control. By developing an end-to-end framework evaluated across three diverse retail tiers—Walmart store panels, Online Retail e-commerce transactions, and the M5 grocery benchmark—we demonstrated that gradient boosted tree architectures (XGBoost and LightGBM) deliver substantial predictive improvements over traditional persistence baselines, reducing out-of-sample RMSE by up to 29.5%.</w:t>
       </w:r>
     </w:p>
     <w:p>

</xml_diff>

<commit_message>
style: standardize inline citation in literature review and update audit certificate
</commit_message>
<xml_diff>
--- a/ML_Inventory_Decision_Support_Paper.docx
+++ b/ML_Inventory_Decision_Support_Paper.docx
@@ -207,14 +207,7 @@
         <w:jc w:val="left"/>
       </w:pPr>
       <w:r>
-        <w:rPr>
-          <w:rFonts w:ascii="Times New Roman" w:hAnsi="Times New Roman"/>
-          <w:b w:val="0"/>
-          <w:i w:val="0"/>
-          <w:color w:val="000000"/>
-          <w:sz w:val="20"/>
-        </w:rPr>
-        <w:t>[1] Syntetos and Boylan evaluated 2,640 inventory series and demonstrated that minimizing Mean Squared Error (MSE) or Mean Absolute Percentage Error (MAPE) does not guarantee minimum inventory costs or optimal fill rates. This supports our finding that statistical loss minimization must be decoupled from operational replenishment evaluation.</w:t>
+        <w:t>Syntetos and Boylan [1] evaluated 2,640 inventory series and demonstrated that minimizing Mean Squared Error (MSE) or Mean Absolute Percentage Error (MAPE) does not guarantee minimum inventory costs or optimal fill rates. This supports our finding that statistical loss minimization must be decoupled from operational replenishment evaluation.</w:t>
         <w:br/>
         <w:br/>
         <w:t>[2] Wallström and Segerstedt investigated intermittent demand metrics and proved that percentage error metrics suffer catastrophic zero-denominator breakdown when demand is zero, introducing severe distortions into model benchmarking.</w:t>

</xml_diff>

<commit_message>
fix: renumber tables sequentially to Table 1 and Table 2 in manuscript
</commit_message>
<xml_diff>
--- a/ML_Inventory_Decision_Support_Paper.docx
+++ b/ML_Inventory_Decision_Support_Paper.docx
@@ -871,14 +871,7 @@
         <w:jc w:val="left"/>
       </w:pPr>
       <w:r>
-        <w:rPr>
-          <w:rFonts w:ascii="Times New Roman" w:hAnsi="Times New Roman"/>
-          <w:b w:val="0"/>
-          <w:i w:val="0"/>
-          <w:color w:val="000000"/>
-          <w:sz w:val="20"/>
-        </w:rPr>
-        <w:t>As reported in Table 2, our proposed Tweedie GBDT and Calibrated Surge Classifier significantly outperform traditional linear baselines and unconstrained point forecasts across all evaluation metrics, achieving a surge detection AUC-ROC of 0.9278 with an accuracy of 83.21%, while Tweedie loss eliminates zero-demand distortion and stabilizes regression error.</w:t>
+        <w:t>As reported in Table 1, our proposed Tweedie GBDT and Calibrated Surge Classifier significantly outperform traditional linear baselines and unconstrained point forecasts across all evaluation metrics, achieving a surge detection AUC-ROC of 0.9278 with an accuracy of 83.21%, while Tweedie loss eliminates zero-demand distortion and stabilizes regression error.</w:t>
       </w:r>
     </w:p>
     <w:p>
@@ -887,13 +880,7 @@
         <w:ind w:firstLine="0"/>
       </w:pPr>
       <w:r>
-        <w:rPr>
-          <w:rFonts w:ascii="Times New Roman" w:hAnsi="Times New Roman"/>
-          <w:b/>
-          <w:color w:val="000000"/>
-          <w:sz w:val="18"/>
-        </w:rPr>
-        <w:t>Table 2. Predictive performance comparison of demand forecasting and surge detection models on the benchmark.</w:t>
+        <w:t>Table 1. Predictive performance comparison of demand forecasting and surge detection models on the benchmark.</w:t>
       </w:r>
     </w:p>
     <w:tbl>
@@ -1646,14 +1633,7 @@
         <w:jc w:val="left"/>
       </w:pPr>
       <w:r>
-        <w:rPr>
-          <w:rFonts w:ascii="Times New Roman" w:hAnsi="Times New Roman"/>
-          <w:b w:val="0"/>
-          <w:i w:val="0"/>
-          <w:color w:val="000000"/>
-          <w:sz w:val="20"/>
-        </w:rPr>
-        <w:t>To evaluate operational and inventory replenishment effectiveness, we simulated 200 diverse retail SKU profiles over 8,000 total interaction steps. Table 3 contrasts the proposed Tri-Criterion bias-safeguarded replenishment policy against three standard ordering strategies.</w:t>
+        <w:t>To evaluate operational and inventory replenishment effectiveness, we simulated 200 diverse retail SKU profiles over 8,000 total interaction steps. Table 2 contrasts the proposed Tri-Criterion bias-safeguarded replenishment policy against three standard ordering strategies.</w:t>
       </w:r>
     </w:p>
     <w:p>
@@ -1662,13 +1642,7 @@
         <w:ind w:firstLine="0"/>
       </w:pPr>
       <w:r>
-        <w:rPr>
-          <w:rFonts w:ascii="Times New Roman" w:hAnsi="Times New Roman"/>
-          <w:b/>
-          <w:color w:val="000000"/>
-          <w:sz w:val="18"/>
-        </w:rPr>
-        <w:t>Table 3. Longitudinal replenishment policy benchmark results across 8,000 simulated interaction steps.</w:t>
+        <w:t>Table 2. Longitudinal replenishment policy benchmark results across 8,000 simulated interaction steps.</w:t>
       </w:r>
     </w:p>
     <w:tbl>

</xml_diff>